<commit_message>
Guide 1 rewritten (install Obsidian, connect it to Claude); Guide 0 login step; card and README updated
</commit_message>
<xml_diff>
--- a/guides/Integration-Setup-Guides.docx
+++ b/guides/Integration-Setup-Guides.docx
@@ -31,7 +31,7 @@
         <w:pStyle w:val="Date"/>
       </w:pPr>
       <w:r>
-        <w:t xml:space="preserve">2026-09-29 (pipeline-tools guide added 2026-10-06; Windows + WSL variant of the Jev guide added 2026-10-09; guides renumbered in setup order 2026-10-13)</w:t>
+        <w:t xml:space="preserve">2026-09-29 (pipeline-tools guide added 2026-10-06; Windows + WSL variant of the Jev guide added 2026-10-09; guides renumbered in setup order 2026-10-13; Obsidian guide rewritten 2026-10-21)</w:t>
       </w:r>
     </w:p>
     <w:sdt>
@@ -911,7 +911,7 @@
               <w:pStyle w:val="Compact"/>
             </w:pPr>
             <w:r>
-              <w:t xml:space="preserve">Obsidian vault</w:t>
+              <w:t xml:space="preserve">Obsidian: install it and connect it to Claude</w:t>
             </w:r>
           </w:p>
         </w:tc>
@@ -944,7 +944,7 @@
               <w:pStyle w:val="Compact"/>
             </w:pPr>
             <w:r>
-              <w:t xml:space="preserve">10 min</w:t>
+              <w:t xml:space="preserve">15 min</w:t>
             </w:r>
           </w:p>
         </w:tc>
@@ -1844,13 +1844,23 @@
           <w:b/>
           <w:bCs/>
         </w:rPr>
-        <w:t xml:space="preserve">Start in the vault folder and log in</w:t>
-      </w:r>
-      <w:r>
-        <w:t xml:space="preserve"> </w:t>
-      </w:r>
-      <w:r>
-        <w:t xml:space="preserve">(Terminal):</w:t>
+        <w:t xml:space="preserve">Log in</w:t>
+      </w:r>
+      <w:r>
+        <w:t xml:space="preserve"> </w:t>
+      </w:r>
+      <w:r>
+        <w:t xml:space="preserve">(Terminal): start Claude once and follow the sign-in steps in the browser. From Guide 1 on, you always start it inside your vault folder.</w:t>
+      </w:r>
+      <w:r>
+        <w:t xml:space="preserve"> </w:t>
+      </w:r>
+      <w:r>
+        <w:rPr>
+          <w:i/>
+          <w:iCs/>
+        </w:rPr>
+        <w:t xml:space="preserve">[docs]</w:t>
       </w:r>
     </w:p>
     <w:p>
@@ -1863,27 +1873,6 @@
       </w:pPr>
       <w:r>
         <w:rPr>
-          <w:rStyle w:val="BuiltInTok"/>
-        </w:rPr>
-        <w:t xml:space="preserve">cd</w:t>
-      </w:r>
-      <w:r>
-        <w:rPr>
-          <w:rStyle w:val="NormalTok"/>
-        </w:rPr>
-        <w:t xml:space="preserve"> </w:t>
-      </w:r>
-      <w:r>
-        <w:rPr>
-          <w:rStyle w:val="StringTok"/>
-        </w:rPr>
-        <w:t xml:space="preserve">"/path/to/Your Vault"</w:t>
-      </w:r>
-      <w:r>
-        <w:br/>
-      </w:r>
-      <w:r>
-        <w:rPr>
           <w:rStyle w:val="ExtensionTok"/>
         </w:rPr>
         <w:t xml:space="preserve">claude</w:t>
@@ -1897,7 +1886,59 @@
         </w:numPr>
       </w:pPr>
       <w:r>
-        <w:t xml:space="preserve">Follow the browser login prompt.</w:t>
+        <w:rPr>
+          <w:b/>
+          <w:bCs/>
+        </w:rPr>
+        <w:t xml:space="preserve">Check:</w:t>
+      </w:r>
+      <w:r>
+        <w:t xml:space="preserve"> </w:t>
+      </w:r>
+      <w:r>
+        <w:t xml:space="preserve">Claude shows its prompt. Type</w:t>
+      </w:r>
+      <w:r>
+        <w:t xml:space="preserve"> </w:t>
+      </w:r>
+      <w:r>
+        <w:rPr>
+          <w:rStyle w:val="VerbatimChar"/>
+        </w:rPr>
+        <w:t xml:space="preserve">/exit</w:t>
+      </w:r>
+      <w:r>
+        <w:t xml:space="preserve"> </w:t>
+      </w:r>
+      <w:r>
+        <w:t xml:space="preserve">to leave.</w:t>
+      </w:r>
+    </w:p>
+    <w:p>
+      <w:pPr>
+        <w:pStyle w:val="FirstParagraph"/>
+      </w:pPr>
+      <w:r>
+        <w:rPr>
+          <w:b/>
+          <w:bCs/>
+        </w:rPr>
+        <w:t xml:space="preserve">If something goes wrong.</w:t>
+      </w:r>
+      <w:r>
+        <w:t xml:space="preserve"> </w:t>
+      </w:r>
+      <w:r>
+        <w:rPr>
+          <w:rStyle w:val="VerbatimChar"/>
+        </w:rPr>
+        <w:t xml:space="preserve">claude: command not found</w:t>
+      </w:r>
+      <w:r>
+        <w:t xml:space="preserve"> </w:t>
+      </w:r>
+      <w:r>
+        <w:t xml:space="preserve">→ the install folder isn’t on your PATH yet; open a new Terminal, or see the troubleshooting page.</w:t>
       </w:r>
       <w:r>
         <w:t xml:space="preserve"> </w:t>
@@ -1909,27 +1950,33 @@
         </w:rPr>
         <w:t xml:space="preserve">[docs]</w:t>
       </w:r>
-      <w:r>
-        <w:t xml:space="preserve"> </w:t>
-      </w:r>
-      <w:r>
-        <w:rPr>
-          <w:b/>
-          <w:bCs/>
-        </w:rPr>
-        <w:t xml:space="preserve">Check:</w:t>
-      </w:r>
-      <w:r>
-        <w:t xml:space="preserve"> </w:t>
-      </w:r>
-      <w:r>
-        <w:t xml:space="preserve">Claude answers inside the vault. Ask it:</w:t>
-      </w:r>
-      <w:r>
-        <w:t xml:space="preserve"> </w:t>
-      </w:r>
-      <w:r>
-        <w:t xml:space="preserve">“Read CLAUDE.md and tell me which file has the highest authority.”</w:t>
+    </w:p>
+    <w:p>
+      <w:pPr>
+        <w:pStyle w:val="BodyText"/>
+      </w:pPr>
+      <w:r>
+        <w:rPr>
+          <w:b/>
+          <w:bCs/>
+        </w:rPr>
+        <w:t xml:space="preserve">Sources.</w:t>
+      </w:r>
+      <w:r>
+        <w:t xml:space="preserve"> </w:t>
+      </w:r>
+      <w:r>
+        <w:t xml:space="preserve">code.claude.com/docs/en/setup (checked 2026-09-29).</w:t>
+      </w:r>
+    </w:p>
+    <w:bookmarkEnd w:id="14"/>
+    <w:bookmarkStart w:id="15" w:name="X5756e2a2f61ef42fa58e38fe4de67d8cd77d715"/>
+    <w:p>
+      <w:pPr>
+        <w:pStyle w:val="Heading1"/>
+      </w:pPr>
+      <w:r>
+        <w:t xml:space="preserve">Guide 1 · Obsidian: install it and connect it to Claude</w:t>
       </w:r>
     </w:p>
     <w:p>
@@ -1941,22 +1988,26 @@
           <w:b/>
           <w:bCs/>
         </w:rPr>
-        <w:t xml:space="preserve">If something goes wrong.</w:t>
-      </w:r>
-      <w:r>
-        <w:t xml:space="preserve"> </w:t>
-      </w:r>
-      <w:r>
-        <w:rPr>
-          <w:rStyle w:val="VerbatimChar"/>
-        </w:rPr>
-        <w:t xml:space="preserve">claude: command not found</w:t>
-      </w:r>
-      <w:r>
-        <w:t xml:space="preserve"> </w:t>
-      </w:r>
-      <w:r>
-        <w:t xml:space="preserve">→ the install folder isn’t on your PATH yet; open a new Terminal, or see the troubleshooting page.</w:t>
+        <w:t xml:space="preserve">What you get.</w:t>
+      </w:r>
+      <w:r>
+        <w:t xml:space="preserve"> </w:t>
+      </w:r>
+      <w:r>
+        <w:t xml:space="preserve">Obsidian is a free app that shows a folder of plain Markdown files as linked notes, with browsing, search, backlinks and the graph view. Connecting it to Claude needs</w:t>
+      </w:r>
+      <w:r>
+        <w:t xml:space="preserve"> </w:t>
+      </w:r>
+      <w:r>
+        <w:rPr>
+          <w:b/>
+          <w:bCs/>
+        </w:rPr>
+        <w:t xml:space="preserve">no plugin and no MCP server</w:t>
+      </w:r>
+      <w:r>
+        <w:t xml:space="preserve">: Claude Code and Obsidian simply work on the same folder. Claude reads and writes the files; Obsidian shows them. Obsidian adds no AI here; it is the interface.</w:t>
       </w:r>
       <w:r>
         <w:t xml:space="preserve"> </w:t>
@@ -1966,7 +2017,7 @@
           <w:i/>
           <w:iCs/>
         </w:rPr>
-        <w:t xml:space="preserve">[docs]</w:t>
+        <w:t xml:space="preserve">[vault]</w:t>
       </w:r>
     </w:p>
     <w:p>
@@ -1978,41 +2029,91 @@
           <w:b/>
           <w:bCs/>
         </w:rPr>
-        <w:t xml:space="preserve">Sources.</w:t>
-      </w:r>
-      <w:r>
-        <w:t xml:space="preserve"> </w:t>
-      </w:r>
-      <w:r>
-        <w:t xml:space="preserve">code.claude.com/docs/en/setup (checked 2026-09-29).</w:t>
-      </w:r>
-    </w:p>
-    <w:bookmarkEnd w:id="14"/>
-    <w:bookmarkStart w:id="15" w:name="guide-1-obsidian-the-knowledge-base"/>
-    <w:p>
-      <w:pPr>
-        <w:pStyle w:val="Heading1"/>
-      </w:pPr>
-      <w:r>
-        <w:t xml:space="preserve">Guide 1 · Obsidian (the knowledge base)</w:t>
-      </w:r>
-    </w:p>
-    <w:p>
-      <w:pPr>
-        <w:pStyle w:val="FirstParagraph"/>
-      </w:pPr>
-      <w:r>
-        <w:rPr>
-          <w:b/>
-          <w:bCs/>
-        </w:rPr>
-        <w:t xml:space="preserve">What you get.</w:t>
-      </w:r>
-      <w:r>
-        <w:t xml:space="preserve"> </w:t>
-      </w:r>
-      <w:r>
-        <w:t xml:space="preserve">A human-friendly window onto the same plain Markdown files Claude works on: browsing, search, backlinks and the graph view. Obsidian adds no AI here; it is the interface.</w:t>
+        <w:t xml:space="preserve">Status:</w:t>
+      </w:r>
+      <w:r>
+        <w:t xml:space="preserve"> </w:t>
+      </w:r>
+      <w:r>
+        <w:t xml:space="preserve">working.</w:t>
+      </w:r>
+      <w:r>
+        <w:t xml:space="preserve"> </w:t>
+      </w:r>
+      <w:r>
+        <w:rPr>
+          <w:b/>
+          <w:bCs/>
+        </w:rPr>
+        <w:t xml:space="preserve">Before you start:</w:t>
+      </w:r>
+      <w:r>
+        <w:t xml:space="preserve"> </w:t>
+      </w:r>
+      <w:r>
+        <w:t xml:space="preserve">Guide 0 done (</w:t>
+      </w:r>
+      <w:r>
+        <w:rPr>
+          <w:rStyle w:val="VerbatimChar"/>
+        </w:rPr>
+        <w:t xml:space="preserve">claude --version</w:t>
+      </w:r>
+      <w:r>
+        <w:t xml:space="preserve"> </w:t>
+      </w:r>
+      <w:r>
+        <w:t xml:space="preserve">prints a version number). Decide where the vault will live, for example in your Documents folder.</w:t>
+      </w:r>
+    </w:p>
+    <w:p>
+      <w:pPr>
+        <w:numPr>
+          <w:ilvl w:val="0"/>
+          <w:numId w:val="1004"/>
+        </w:numPr>
+      </w:pPr>
+      <w:r>
+        <w:rPr>
+          <w:b/>
+          <w:bCs/>
+        </w:rPr>
+        <w:t xml:space="preserve">Install Obsidian</w:t>
+      </w:r>
+      <w:r>
+        <w:t xml:space="preserve"> </w:t>
+      </w:r>
+      <w:r>
+        <w:t xml:space="preserve">(browser, then the installer): download it from obsidian.md (under macOS or Windows, click</w:t>
+      </w:r>
+      <w:r>
+        <w:t xml:space="preserve"> </w:t>
+      </w:r>
+      <w:r>
+        <w:rPr>
+          <w:b/>
+          <w:bCs/>
+        </w:rPr>
+        <w:t xml:space="preserve">Universal</w:t>
+      </w:r>
+      <w:r>
+        <w:t xml:space="preserve">). Mac: open the file and drag Obsidian to the</w:t>
+      </w:r>
+      <w:r>
+        <w:t xml:space="preserve"> </w:t>
+      </w:r>
+      <w:r>
+        <w:rPr>
+          <w:b/>
+          <w:bCs/>
+        </w:rPr>
+        <w:t xml:space="preserve">Applications</w:t>
+      </w:r>
+      <w:r>
+        <w:t xml:space="preserve"> </w:t>
+      </w:r>
+      <w:r>
+        <w:t xml:space="preserve">folder. Windows: open the file and follow the instructions.</w:t>
       </w:r>
       <w:r>
         <w:t xml:space="preserve"> </w:t>
@@ -2022,41 +2123,23 @@
           <w:i/>
           <w:iCs/>
         </w:rPr>
-        <w:t xml:space="preserve">[vault]</w:t>
-      </w:r>
-    </w:p>
-    <w:p>
-      <w:pPr>
-        <w:pStyle w:val="BodyText"/>
-      </w:pPr>
-      <w:r>
-        <w:rPr>
-          <w:b/>
-          <w:bCs/>
-        </w:rPr>
-        <w:t xml:space="preserve">Status:</w:t>
-      </w:r>
-      <w:r>
-        <w:t xml:space="preserve"> </w:t>
-      </w:r>
-      <w:r>
-        <w:t xml:space="preserve">working.</w:t>
-      </w:r>
-      <w:r>
-        <w:t xml:space="preserve"> </w:t>
-      </w:r>
-      <w:r>
-        <w:rPr>
-          <w:b/>
-          <w:bCs/>
-        </w:rPr>
-        <w:t xml:space="preserve">Before you start:</w:t>
-      </w:r>
-      <w:r>
-        <w:t xml:space="preserve"> </w:t>
-      </w:r>
-      <w:r>
-        <w:t xml:space="preserve">Obsidian installed from obsidian.md.</w:t>
+        <w:t xml:space="preserve">[docs]</w:t>
+      </w:r>
+      <w:r>
+        <w:t xml:space="preserve"> </w:t>
+      </w:r>
+      <w:r>
+        <w:rPr>
+          <w:b/>
+          <w:bCs/>
+        </w:rPr>
+        <w:t xml:space="preserve">Check:</w:t>
+      </w:r>
+      <w:r>
+        <w:t xml:space="preserve"> </w:t>
+      </w:r>
+      <w:r>
+        <w:t xml:space="preserve">Obsidian opens like any other app (Applications on a Mac, the Start menu on Windows).</w:t>
       </w:r>
     </w:p>
     <w:p>
@@ -2071,13 +2154,36 @@
           <w:b/>
           <w:bCs/>
         </w:rPr>
-        <w:t xml:space="preserve">Create the folder structure</w:t>
-      </w:r>
-      <w:r>
-        <w:t xml:space="preserve"> </w:t>
-      </w:r>
-      <w:r>
-        <w:t xml:space="preserve">(Terminal, or ask Claude to do it):</w:t>
+        <w:t xml:space="preserve">Create the vault folder</w:t>
+      </w:r>
+      <w:r>
+        <w:t xml:space="preserve"> </w:t>
+      </w:r>
+      <w:r>
+        <w:t xml:space="preserve">(Terminal, or ask Claude to do it). The first line moves the Terminal to your Documents folder; the next lines create the folders and the empty rule files. If macOS asks whether Terminal may access files in your Documents folder, click</w:t>
+      </w:r>
+      <w:r>
+        <w:t xml:space="preserve"> </w:t>
+      </w:r>
+      <w:r>
+        <w:rPr>
+          <w:b/>
+          <w:bCs/>
+        </w:rPr>
+        <w:t xml:space="preserve">Allow</w:t>
+      </w:r>
+      <w:r>
+        <w:t xml:space="preserve">.</w:t>
+      </w:r>
+      <w:r>
+        <w:t xml:space="preserve"> </w:t>
+      </w:r>
+      <w:r>
+        <w:rPr>
+          <w:i/>
+          <w:iCs/>
+        </w:rPr>
+        <w:t xml:space="preserve">[vault: folder structure]</w:t>
       </w:r>
     </w:p>
     <w:p>
@@ -2090,6 +2196,21 @@
       </w:pPr>
       <w:r>
         <w:rPr>
+          <w:rStyle w:val="BuiltInTok"/>
+        </w:rPr>
+        <w:t xml:space="preserve">cd</w:t>
+      </w:r>
+      <w:r>
+        <w:rPr>
+          <w:rStyle w:val="NormalTok"/>
+        </w:rPr>
+        <w:t xml:space="preserve"> ~/Documents</w:t>
+      </w:r>
+      <w:r>
+        <w:br/>
+      </w:r>
+      <w:r>
+        <w:rPr>
           <w:rStyle w:val="FunctionTok"/>
         </w:rPr>
         <w:t xml:space="preserve">mkdir</w:t>
@@ -2318,6 +2439,27 @@
           <w:rStyle w:val="DataTypeTok"/>
         </w:rPr>
         <w:t xml:space="preserve">RESEARCH_PROTOCOL.md}</w:t>
+      </w:r>
+      <w:r>
+        <w:br/>
+      </w:r>
+      <w:r>
+        <w:rPr>
+          <w:rStyle w:val="FunctionTok"/>
+        </w:rPr>
+        <w:t xml:space="preserve">ls</w:t>
+      </w:r>
+      <w:r>
+        <w:rPr>
+          <w:rStyle w:val="NormalTok"/>
+        </w:rPr>
+        <w:t xml:space="preserve"> </w:t>
+      </w:r>
+      <w:r>
+        <w:rPr>
+          <w:rStyle w:val="StringTok"/>
+        </w:rPr>
+        <w:t xml:space="preserve">"Second Brain"</w:t>
       </w:r>
     </w:p>
     <w:p>
@@ -2341,13 +2483,171 @@
         <w:rPr>
           <w:rStyle w:val="VerbatimChar"/>
         </w:rPr>
-        <w:t xml:space="preserve">ls "Second Brain"</w:t>
-      </w:r>
-      <w:r>
-        <w:t xml:space="preserve"> </w:t>
-      </w:r>
-      <w:r>
-        <w:t xml:space="preserve">shows the folders.</w:t>
+        <w:t xml:space="preserve">ls</w:t>
+      </w:r>
+      <w:r>
+        <w:t xml:space="preserve"> </w:t>
+      </w:r>
+      <w:r>
+        <w:t xml:space="preserve">lists</w:t>
+      </w:r>
+      <w:r>
+        <w:t xml:space="preserve"> </w:t>
+      </w:r>
+      <w:r>
+        <w:rPr>
+          <w:rStyle w:val="VerbatimChar"/>
+        </w:rPr>
+        <w:t xml:space="preserve">00-System</w:t>
+      </w:r>
+      <w:r>
+        <w:t xml:space="preserve">,</w:t>
+      </w:r>
+      <w:r>
+        <w:t xml:space="preserve"> </w:t>
+      </w:r>
+      <w:r>
+        <w:rPr>
+          <w:rStyle w:val="VerbatimChar"/>
+        </w:rPr>
+        <w:t xml:space="preserve">01-Library</w:t>
+      </w:r>
+      <w:r>
+        <w:t xml:space="preserve">,</w:t>
+      </w:r>
+      <w:r>
+        <w:t xml:space="preserve"> </w:t>
+      </w:r>
+      <w:r>
+        <w:rPr>
+          <w:rStyle w:val="VerbatimChar"/>
+        </w:rPr>
+        <w:t xml:space="preserve">02-Wiki</w:t>
+      </w:r>
+      <w:r>
+        <w:t xml:space="preserve"> </w:t>
+      </w:r>
+      <w:r>
+        <w:t xml:space="preserve">… and the four</w:t>
+      </w:r>
+      <w:r>
+        <w:t xml:space="preserve"> </w:t>
+      </w:r>
+      <w:r>
+        <w:rPr>
+          <w:rStyle w:val="VerbatimChar"/>
+        </w:rPr>
+        <w:t xml:space="preserve">.md</w:t>
+      </w:r>
+      <w:r>
+        <w:t xml:space="preserve"> </w:t>
+      </w:r>
+      <w:r>
+        <w:t xml:space="preserve">files.</w:t>
+      </w:r>
+    </w:p>
+    <w:p>
+      <w:pPr>
+        <w:numPr>
+          <w:ilvl w:val="0"/>
+          <w:numId w:val="1004"/>
+        </w:numPr>
+      </w:pPr>
+      <w:r>
+        <w:rPr>
+          <w:b/>
+          <w:bCs/>
+        </w:rPr>
+        <w:t xml:space="preserve">Open the folder in Obsidian</w:t>
+      </w:r>
+      <w:r>
+        <w:t xml:space="preserve"> </w:t>
+      </w:r>
+      <w:r>
+        <w:t xml:space="preserve">(Obsidian app). The vault window opens the first time you start Obsidian (later: the</w:t>
+      </w:r>
+      <w:r>
+        <w:t xml:space="preserve"> </w:t>
+      </w:r>
+      <w:r>
+        <w:rPr>
+          <w:b/>
+          <w:bCs/>
+        </w:rPr>
+        <w:t xml:space="preserve">Vault profile</w:t>
+      </w:r>
+      <w:r>
+        <w:t xml:space="preserve"> </w:t>
+      </w:r>
+      <w:r>
+        <w:t xml:space="preserve">icon at the bottom left →</w:t>
+      </w:r>
+      <w:r>
+        <w:t xml:space="preserve"> </w:t>
+      </w:r>
+      <w:r>
+        <w:rPr>
+          <w:b/>
+          <w:bCs/>
+        </w:rPr>
+        <w:t xml:space="preserve">Manage Vaults…</w:t>
+      </w:r>
+      <w:r>
+        <w:t xml:space="preserve">). Next to</w:t>
+      </w:r>
+      <w:r>
+        <w:t xml:space="preserve"> </w:t>
+      </w:r>
+      <w:r>
+        <w:rPr>
+          <w:b/>
+          <w:bCs/>
+        </w:rPr>
+        <w:t xml:space="preserve">Open folder as vault</w:t>
+      </w:r>
+      <w:r>
+        <w:t xml:space="preserve">, click</w:t>
+      </w:r>
+      <w:r>
+        <w:t xml:space="preserve"> </w:t>
+      </w:r>
+      <w:r>
+        <w:rPr>
+          <w:b/>
+          <w:bCs/>
+        </w:rPr>
+        <w:t xml:space="preserve">Open</w:t>
+      </w:r>
+      <w:r>
+        <w:t xml:space="preserve">, select the</w:t>
+      </w:r>
+      <w:r>
+        <w:t xml:space="preserve"> </w:t>
+      </w:r>
+      <w:r>
+        <w:rPr>
+          <w:rStyle w:val="VerbatimChar"/>
+        </w:rPr>
+        <w:t xml:space="preserve">Second Brain</w:t>
+      </w:r>
+      <w:r>
+        <w:t xml:space="preserve"> </w:t>
+      </w:r>
+      <w:r>
+        <w:t xml:space="preserve">folder and click</w:t>
+      </w:r>
+      <w:r>
+        <w:t xml:space="preserve"> </w:t>
+      </w:r>
+      <w:r>
+        <w:rPr>
+          <w:b/>
+          <w:bCs/>
+        </w:rPr>
+        <w:t xml:space="preserve">Open</w:t>
+      </w:r>
+      <w:r>
+        <w:t xml:space="preserve">.</w:t>
       </w:r>
       <w:r>
         <w:t xml:space="preserve"> </w:t>
@@ -2357,7 +2657,23 @@
           <w:i/>
           <w:iCs/>
         </w:rPr>
-        <w:t xml:space="preserve">[vault: folder structure]</w:t>
+        <w:t xml:space="preserve">[docs]</w:t>
+      </w:r>
+      <w:r>
+        <w:t xml:space="preserve"> </w:t>
+      </w:r>
+      <w:r>
+        <w:rPr>
+          <w:b/>
+          <w:bCs/>
+        </w:rPr>
+        <w:t xml:space="preserve">Check:</w:t>
+      </w:r>
+      <w:r>
+        <w:t xml:space="preserve"> </w:t>
+      </w:r>
+      <w:r>
+        <w:t xml:space="preserve">the folders appear in Obsidian’s file explorer on the left.</w:t>
       </w:r>
     </w:p>
     <w:p>
@@ -2372,87 +2688,28 @@
           <w:b/>
           <w:bCs/>
         </w:rPr>
-        <w:t xml:space="preserve">Open the folder as a vault</w:t>
-      </w:r>
-      <w:r>
-        <w:t xml:space="preserve"> </w:t>
-      </w:r>
-      <w:r>
-        <w:t xml:space="preserve">(Obsidian app):</w:t>
-      </w:r>
-      <w:r>
-        <w:t xml:space="preserve"> </w:t>
-      </w:r>
-      <w:r>
-        <w:rPr>
-          <w:b/>
-          <w:bCs/>
-        </w:rPr>
-        <w:t xml:space="preserve">Vault profile</w:t>
-      </w:r>
-      <w:r>
-        <w:t xml:space="preserve"> </w:t>
-      </w:r>
-      <w:r>
-        <w:t xml:space="preserve">(bottom left) →</w:t>
-      </w:r>
-      <w:r>
-        <w:t xml:space="preserve"> </w:t>
-      </w:r>
-      <w:r>
-        <w:rPr>
-          <w:b/>
-          <w:bCs/>
-        </w:rPr>
-        <w:t xml:space="preserve">Manage Vaults…</w:t>
-      </w:r>
-      <w:r>
-        <w:t xml:space="preserve"> </w:t>
-      </w:r>
-      <w:r>
-        <w:t xml:space="preserve">→ next to</w:t>
-      </w:r>
-      <w:r>
-        <w:t xml:space="preserve"> </w:t>
-      </w:r>
-      <w:r>
-        <w:rPr>
-          <w:b/>
-          <w:bCs/>
-        </w:rPr>
-        <w:t xml:space="preserve">Open folder as vault</w:t>
-      </w:r>
-      <w:r>
-        <w:t xml:space="preserve">, select</w:t>
-      </w:r>
-      <w:r>
-        <w:t xml:space="preserve"> </w:t>
-      </w:r>
-      <w:r>
-        <w:rPr>
-          <w:b/>
-          <w:bCs/>
-        </w:rPr>
-        <w:t xml:space="preserve">Open</w:t>
-      </w:r>
-      <w:r>
-        <w:t xml:space="preserve"> </w:t>
-      </w:r>
-      <w:r>
-        <w:t xml:space="preserve">→ choose the folder →</w:t>
-      </w:r>
-      <w:r>
-        <w:t xml:space="preserve"> </w:t>
-      </w:r>
-      <w:r>
-        <w:rPr>
-          <w:b/>
-          <w:bCs/>
-        </w:rPr>
-        <w:t xml:space="preserve">Open</w:t>
-      </w:r>
-      <w:r>
-        <w:t xml:space="preserve">.</w:t>
+        <w:t xml:space="preserve">Start Claude Code inside the vault</w:t>
+      </w:r>
+      <w:r>
+        <w:t xml:space="preserve"> </w:t>
+      </w:r>
+      <w:r>
+        <w:t xml:space="preserve">(Terminal). This is the whole connection: Claude works on the folder you start it in. Tip: type</w:t>
+      </w:r>
+      <w:r>
+        <w:t xml:space="preserve"> </w:t>
+      </w:r>
+      <w:r>
+        <w:rPr>
+          <w:rStyle w:val="VerbatimChar"/>
+        </w:rPr>
+        <w:t xml:space="preserve">cd</w:t>
+      </w:r>
+      <w:r>
+        <w:t xml:space="preserve"> </w:t>
+      </w:r>
+      <w:r>
+        <w:t xml:space="preserve">and a space, then drag the folder from Finder onto the Terminal window to paste its path. If Claude asks whether you trust the files in this folder, confirm.</w:t>
       </w:r>
       <w:r>
         <w:t xml:space="preserve"> </w:t>
@@ -2464,9 +2721,50 @@
         </w:rPr>
         <w:t xml:space="preserve">[docs]</w:t>
       </w:r>
-      <w:r>
-        <w:t xml:space="preserve"> </w:t>
-      </w:r>
+    </w:p>
+    <w:p>
+      <w:pPr>
+        <w:pStyle w:val="SourceCode"/>
+        <w:numPr>
+          <w:ilvl w:val="0"/>
+          <w:numId w:val="1000"/>
+        </w:numPr>
+      </w:pPr>
+      <w:r>
+        <w:rPr>
+          <w:rStyle w:val="BuiltInTok"/>
+        </w:rPr>
+        <w:t xml:space="preserve">cd</w:t>
+      </w:r>
+      <w:r>
+        <w:rPr>
+          <w:rStyle w:val="NormalTok"/>
+        </w:rPr>
+        <w:t xml:space="preserve"> ~/Documents/</w:t>
+      </w:r>
+      <w:r>
+        <w:rPr>
+          <w:rStyle w:val="StringTok"/>
+        </w:rPr>
+        <w:t xml:space="preserve">"Second Brain"</w:t>
+      </w:r>
+      <w:r>
+        <w:br/>
+      </w:r>
+      <w:r>
+        <w:rPr>
+          <w:rStyle w:val="ExtensionTok"/>
+        </w:rPr>
+        <w:t xml:space="preserve">claude</w:t>
+      </w:r>
+    </w:p>
+    <w:p>
+      <w:pPr>
+        <w:numPr>
+          <w:ilvl w:val="0"/>
+          <w:numId w:val="1000"/>
+        </w:numPr>
+      </w:pPr>
       <w:r>
         <w:rPr>
           <w:b/>
@@ -2478,7 +2776,19 @@
         <w:t xml:space="preserve"> </w:t>
       </w:r>
       <w:r>
-        <w:t xml:space="preserve">the folders appear in Obsidian’s file explorer.</w:t>
+        <w:t xml:space="preserve">ask</w:t>
+      </w:r>
+      <w:r>
+        <w:t xml:space="preserve"> </w:t>
+      </w:r>
+      <w:r>
+        <w:t xml:space="preserve">“List the top-level folders of this vault.”</w:t>
+      </w:r>
+      <w:r>
+        <w:t xml:space="preserve"> </w:t>
+      </w:r>
+      <w:r>
+        <w:t xml:space="preserve">Claude names the same folders Obsidian shows.</w:t>
       </w:r>
     </w:p>
     <w:p>
@@ -2493,43 +2803,13 @@
           <w:b/>
           <w:bCs/>
         </w:rPr>
-        <w:t xml:space="preserve">Write the rulebook</w:t>
-      </w:r>
-      <w:r>
-        <w:t xml:space="preserve"> </w:t>
-      </w:r>
-      <w:r>
-        <w:t xml:space="preserve">(inside Claude Code): ask Claude to draft</w:t>
-      </w:r>
-      <w:r>
-        <w:t xml:space="preserve"> </w:t>
-      </w:r>
-      <w:r>
-        <w:rPr>
-          <w:rStyle w:val="VerbatimChar"/>
-        </w:rPr>
-        <w:t xml:space="preserve">CLAUDE.md</w:t>
-      </w:r>
-      <w:r>
-        <w:t xml:space="preserve"> </w:t>
-      </w:r>
-      <w:r>
-        <w:t xml:space="preserve">(workflows, page template with YAML frontmatter, naming and safety rules) and</w:t>
-      </w:r>
-      <w:r>
-        <w:t xml:space="preserve"> </w:t>
-      </w:r>
-      <w:r>
-        <w:rPr>
-          <w:rStyle w:val="VerbatimChar"/>
-        </w:rPr>
-        <w:t xml:space="preserve">RESEARCH_PROTOCOL.md</w:t>
-      </w:r>
-      <w:r>
-        <w:t xml:space="preserve"> </w:t>
-      </w:r>
-      <w:r>
-        <w:t xml:space="preserve">(no invented citations; separate source claims from interpretation). Review both yourself.</w:t>
+        <w:t xml:space="preserve">Round-trip test</w:t>
+      </w:r>
+      <w:r>
+        <w:t xml:space="preserve"> </w:t>
+      </w:r>
+      <w:r>
+        <w:t xml:space="preserve">(inside Claude Code): ask Claude to write a test note and watch it appear in Obsidian.</w:t>
       </w:r>
       <w:r>
         <w:t xml:space="preserve"> </w:t>
@@ -2541,9 +2821,29 @@
         </w:rPr>
         <w:t xml:space="preserve">[vault]</w:t>
       </w:r>
-      <w:r>
-        <w:t xml:space="preserve"> </w:t>
-      </w:r>
+    </w:p>
+    <w:p>
+      <w:pPr>
+        <w:pStyle w:val="SourceCode"/>
+        <w:numPr>
+          <w:ilvl w:val="0"/>
+          <w:numId w:val="1000"/>
+        </w:numPr>
+      </w:pPr>
+      <w:r>
+        <w:rPr>
+          <w:rStyle w:val="VerbatimChar"/>
+        </w:rPr>
+        <w:t xml:space="preserve">Create 05-Inbox/hello-obsidian.md with a heading, one sentence and a [[index]] link.</w:t>
+      </w:r>
+    </w:p>
+    <w:p>
+      <w:pPr>
+        <w:numPr>
+          <w:ilvl w:val="0"/>
+          <w:numId w:val="1000"/>
+        </w:numPr>
+      </w:pPr>
       <w:r>
         <w:rPr>
           <w:b/>
@@ -2555,28 +2855,19 @@
         <w:t xml:space="preserve"> </w:t>
       </w:r>
       <w:r>
-        <w:t xml:space="preserve">a new Claude Code session, asked</w:t>
-      </w:r>
-      <w:r>
-        <w:t xml:space="preserve"> </w:t>
-      </w:r>
-      <w:r>
-        <w:t xml:space="preserve">“What is the default status of a new wiki page?”</w:t>
-      </w:r>
-      <w:r>
-        <w:t xml:space="preserve">, answers</w:t>
-      </w:r>
-      <w:r>
-        <w:t xml:space="preserve"> </w:t>
-      </w:r>
-      <w:r>
-        <w:rPr>
-          <w:rStyle w:val="VerbatimChar"/>
-        </w:rPr>
-        <w:t xml:space="preserve">needs-verification</w:t>
-      </w:r>
-      <w:r>
-        <w:t xml:space="preserve">.</w:t>
+        <w:t xml:space="preserve">the note appears in Obsidian’s file explorer within seconds and the link opens</w:t>
+      </w:r>
+      <w:r>
+        <w:t xml:space="preserve"> </w:t>
+      </w:r>
+      <w:r>
+        <w:rPr>
+          <w:rStyle w:val="VerbatimChar"/>
+        </w:rPr>
+        <w:t xml:space="preserve">index.md</w:t>
+      </w:r>
+      <w:r>
+        <w:t xml:space="preserve">. Delete the note afterwards.</w:t>
       </w:r>
     </w:p>
     <w:p>
@@ -2591,40 +2882,43 @@
           <w:b/>
           <w:bCs/>
         </w:rPr>
-        <w:t xml:space="preserve">Add the router and contract</w:t>
-      </w:r>
-      <w:r>
-        <w:t xml:space="preserve">:</w:t>
-      </w:r>
-      <w:r>
-        <w:t xml:space="preserve"> </w:t>
-      </w:r>
-      <w:r>
-        <w:rPr>
-          <w:rStyle w:val="VerbatimChar"/>
-        </w:rPr>
-        <w:t xml:space="preserve">00-System/START-HERE.md</w:t>
-      </w:r>
-      <w:r>
-        <w:t xml:space="preserve"> </w:t>
-      </w:r>
-      <w:r>
-        <w:t xml:space="preserve">(which files to load for which task) and</w:t>
-      </w:r>
-      <w:r>
-        <w:t xml:space="preserve"> </w:t>
-      </w:r>
-      <w:r>
-        <w:rPr>
-          <w:rStyle w:val="VerbatimChar"/>
-        </w:rPr>
-        <w:t xml:space="preserve">00-System/ENGINEERING-CONTRACT.md</w:t>
-      </w:r>
-      <w:r>
-        <w:t xml:space="preserve"> </w:t>
-      </w:r>
-      <w:r>
-        <w:t xml:space="preserve">(memory types, write gate, workflow graphs, link rules).</w:t>
+        <w:t xml:space="preserve">Write the rulebook</w:t>
+      </w:r>
+      <w:r>
+        <w:t xml:space="preserve"> </w:t>
+      </w:r>
+      <w:r>
+        <w:t xml:space="preserve">(inside Claude Code): ask Claude to draft</w:t>
+      </w:r>
+      <w:r>
+        <w:t xml:space="preserve"> </w:t>
+      </w:r>
+      <w:r>
+        <w:rPr>
+          <w:rStyle w:val="VerbatimChar"/>
+        </w:rPr>
+        <w:t xml:space="preserve">CLAUDE.md</w:t>
+      </w:r>
+      <w:r>
+        <w:t xml:space="preserve"> </w:t>
+      </w:r>
+      <w:r>
+        <w:t xml:space="preserve">(workflows, page template with YAML frontmatter, naming and safety rules) and</w:t>
+      </w:r>
+      <w:r>
+        <w:t xml:space="preserve"> </w:t>
+      </w:r>
+      <w:r>
+        <w:rPr>
+          <w:rStyle w:val="VerbatimChar"/>
+        </w:rPr>
+        <w:t xml:space="preserve">RESEARCH_PROTOCOL.md</w:t>
+      </w:r>
+      <w:r>
+        <w:t xml:space="preserve"> </w:t>
+      </w:r>
+      <w:r>
+        <w:t xml:space="preserve">(no invented citations; separate source claims from interpretation). Review both yourself.</w:t>
       </w:r>
       <w:r>
         <w:t xml:space="preserve"> </w:t>
@@ -2636,6 +2930,43 @@
         </w:rPr>
         <w:t xml:space="preserve">[vault]</w:t>
       </w:r>
+      <w:r>
+        <w:t xml:space="preserve"> </w:t>
+      </w:r>
+      <w:r>
+        <w:rPr>
+          <w:b/>
+          <w:bCs/>
+        </w:rPr>
+        <w:t xml:space="preserve">Check:</w:t>
+      </w:r>
+      <w:r>
+        <w:t xml:space="preserve"> </w:t>
+      </w:r>
+      <w:r>
+        <w:t xml:space="preserve">a new Claude Code session, asked</w:t>
+      </w:r>
+      <w:r>
+        <w:t xml:space="preserve"> </w:t>
+      </w:r>
+      <w:r>
+        <w:t xml:space="preserve">“What is the default status of a new wiki page?”</w:t>
+      </w:r>
+      <w:r>
+        <w:t xml:space="preserve">, answers</w:t>
+      </w:r>
+      <w:r>
+        <w:t xml:space="preserve"> </w:t>
+      </w:r>
+      <w:r>
+        <w:rPr>
+          <w:rStyle w:val="VerbatimChar"/>
+        </w:rPr>
+        <w:t xml:space="preserve">needs-verification</w:t>
+      </w:r>
+      <w:r>
+        <w:t xml:space="preserve">.</w:t>
+      </w:r>
     </w:p>
     <w:p>
       <w:pPr>
@@ -2649,28 +2980,43 @@
           <w:b/>
           <w:bCs/>
         </w:rPr>
-        <w:t xml:space="preserve">Use the graph view</w:t>
-      </w:r>
-      <w:r>
-        <w:t xml:space="preserve"> </w:t>
-      </w:r>
-      <w:r>
-        <w:t xml:space="preserve">(Obsidian): open the graph view to see</w:t>
-      </w:r>
-      <w:r>
-        <w:t xml:space="preserve"> </w:t>
-      </w:r>
-      <w:r>
-        <w:rPr>
-          <w:rStyle w:val="VerbatimChar"/>
-        </w:rPr>
-        <w:t xml:space="preserve">[[wikilinks]]</w:t>
-      </w:r>
-      <w:r>
-        <w:t xml:space="preserve"> </w:t>
-      </w:r>
-      <w:r>
-        <w:t xml:space="preserve">as a network.</w:t>
+        <w:t xml:space="preserve">Add the router and contract</w:t>
+      </w:r>
+      <w:r>
+        <w:t xml:space="preserve"> </w:t>
+      </w:r>
+      <w:r>
+        <w:t xml:space="preserve">(inside Claude Code):</w:t>
+      </w:r>
+      <w:r>
+        <w:t xml:space="preserve"> </w:t>
+      </w:r>
+      <w:r>
+        <w:rPr>
+          <w:rStyle w:val="VerbatimChar"/>
+        </w:rPr>
+        <w:t xml:space="preserve">00-System/START-HERE.md</w:t>
+      </w:r>
+      <w:r>
+        <w:t xml:space="preserve"> </w:t>
+      </w:r>
+      <w:r>
+        <w:t xml:space="preserve">(which files to load for which task) and</w:t>
+      </w:r>
+      <w:r>
+        <w:t xml:space="preserve"> </w:t>
+      </w:r>
+      <w:r>
+        <w:rPr>
+          <w:rStyle w:val="VerbatimChar"/>
+        </w:rPr>
+        <w:t xml:space="preserve">00-System/ENGINEERING-CONTRACT.md</w:t>
+      </w:r>
+      <w:r>
+        <w:t xml:space="preserve"> </w:t>
+      </w:r>
+      <w:r>
+        <w:t xml:space="preserve">(memory types, write gate, workflow graphs, link rules).</w:t>
       </w:r>
       <w:r>
         <w:t xml:space="preserve"> </w:t>
@@ -2682,6 +3028,89 @@
         </w:rPr>
         <w:t xml:space="preserve">[vault]</w:t>
       </w:r>
+      <w:r>
+        <w:t xml:space="preserve"> </w:t>
+      </w:r>
+      <w:r>
+        <w:rPr>
+          <w:b/>
+          <w:bCs/>
+        </w:rPr>
+        <w:t xml:space="preserve">Check:</w:t>
+      </w:r>
+      <w:r>
+        <w:t xml:space="preserve"> </w:t>
+      </w:r>
+      <w:r>
+        <w:t xml:space="preserve">a new session, asked</w:t>
+      </w:r>
+      <w:r>
+        <w:t xml:space="preserve"> </w:t>
+      </w:r>
+      <w:r>
+        <w:t xml:space="preserve">“Read CLAUDE.md and tell me which file has the highest authority”</w:t>
+      </w:r>
+      <w:r>
+        <w:t xml:space="preserve">, names</w:t>
+      </w:r>
+      <w:r>
+        <w:t xml:space="preserve"> </w:t>
+      </w:r>
+      <w:r>
+        <w:rPr>
+          <w:rStyle w:val="VerbatimChar"/>
+        </w:rPr>
+        <w:t xml:space="preserve">RESEARCH_PROTOCOL.md</w:t>
+      </w:r>
+      <w:r>
+        <w:t xml:space="preserve">.</w:t>
+      </w:r>
+    </w:p>
+    <w:p>
+      <w:pPr>
+        <w:numPr>
+          <w:ilvl w:val="0"/>
+          <w:numId w:val="1004"/>
+        </w:numPr>
+      </w:pPr>
+      <w:r>
+        <w:rPr>
+          <w:b/>
+          <w:bCs/>
+        </w:rPr>
+        <w:t xml:space="preserve">Use the graph view</w:t>
+      </w:r>
+      <w:r>
+        <w:t xml:space="preserve"> </w:t>
+      </w:r>
+      <w:r>
+        <w:t xml:space="preserve">(Obsidian): open the graph view to see</w:t>
+      </w:r>
+      <w:r>
+        <w:t xml:space="preserve"> </w:t>
+      </w:r>
+      <w:r>
+        <w:rPr>
+          <w:rStyle w:val="VerbatimChar"/>
+        </w:rPr>
+        <w:t xml:space="preserve">[[wikilinks]]</w:t>
+      </w:r>
+      <w:r>
+        <w:t xml:space="preserve"> </w:t>
+      </w:r>
+      <w:r>
+        <w:t xml:space="preserve">as a network.</w:t>
+      </w:r>
+      <w:r>
+        <w:t xml:space="preserve"> </w:t>
+      </w:r>
+      <w:r>
+        <w:rPr>
+          <w:i/>
+          <w:iCs/>
+        </w:rPr>
+        <w:t xml:space="preserve">[vault]</w:t>
+      </w:r>
     </w:p>
     <w:p>
       <w:pPr>
@@ -2692,6 +3121,119 @@
           <w:b/>
           <w:bCs/>
         </w:rPr>
+        <w:t xml:space="preserve">If something goes wrong.</w:t>
+      </w:r>
+    </w:p>
+    <w:p>
+      <w:pPr>
+        <w:pStyle w:val="Compact"/>
+        <w:numPr>
+          <w:ilvl w:val="0"/>
+          <w:numId w:val="1005"/>
+        </w:numPr>
+      </w:pPr>
+      <w:r>
+        <w:t xml:space="preserve">Claude’s new note does not show in Obsidian → ask Claude to run</w:t>
+      </w:r>
+      <w:r>
+        <w:t xml:space="preserve"> </w:t>
+      </w:r>
+      <w:r>
+        <w:rPr>
+          <w:rStyle w:val="VerbatimChar"/>
+        </w:rPr>
+        <w:t xml:space="preserve">pwd</w:t>
+      </w:r>
+      <w:r>
+        <w:t xml:space="preserve">: it must print the same folder Obsidian opened.</w:t>
+      </w:r>
+    </w:p>
+    <w:p>
+      <w:pPr>
+        <w:pStyle w:val="Compact"/>
+        <w:numPr>
+          <w:ilvl w:val="0"/>
+          <w:numId w:val="1005"/>
+        </w:numPr>
+      </w:pPr>
+      <w:r>
+        <w:t xml:space="preserve">“Operation not permitted”</w:t>
+      </w:r>
+      <w:r>
+        <w:t xml:space="preserve"> </w:t>
+      </w:r>
+      <w:r>
+        <w:t xml:space="preserve">in the Terminal (macOS) →</w:t>
+      </w:r>
+      <w:r>
+        <w:t xml:space="preserve"> </w:t>
+      </w:r>
+      <w:r>
+        <w:rPr>
+          <w:b/>
+          <w:bCs/>
+        </w:rPr>
+        <w:t xml:space="preserve">System Settings → Privacy &amp; Security → Files &amp; Folders</w:t>
+      </w:r>
+      <w:r>
+        <w:t xml:space="preserve"> </w:t>
+      </w:r>
+      <w:r>
+        <w:t xml:space="preserve">→ allow</w:t>
+      </w:r>
+      <w:r>
+        <w:t xml:space="preserve"> </w:t>
+      </w:r>
+      <w:r>
+        <w:rPr>
+          <w:b/>
+          <w:bCs/>
+        </w:rPr>
+        <w:t xml:space="preserve">Documents</w:t>
+      </w:r>
+      <w:r>
+        <w:t xml:space="preserve"> </w:t>
+      </w:r>
+      <w:r>
+        <w:t xml:space="preserve">for Terminal (or VS Code), then reopen it.</w:t>
+      </w:r>
+    </w:p>
+    <w:p>
+      <w:pPr>
+        <w:pStyle w:val="Compact"/>
+        <w:numPr>
+          <w:ilvl w:val="0"/>
+          <w:numId w:val="1005"/>
+        </w:numPr>
+      </w:pPr>
+      <w:r>
+        <w:t xml:space="preserve">Windows: PowerShell does not understand the</w:t>
+      </w:r>
+      <w:r>
+        <w:t xml:space="preserve"> </w:t>
+      </w:r>
+      <w:r>
+        <w:rPr>
+          <w:rStyle w:val="VerbatimChar"/>
+        </w:rPr>
+        <w:t xml:space="preserve">{…}</w:t>
+      </w:r>
+      <w:r>
+        <w:t xml:space="preserve"> </w:t>
+      </w:r>
+      <w:r>
+        <w:t xml:space="preserve">shortcut in step 2; run it in WSL or Git Bash, or create the folders in File Explorer.</w:t>
+      </w:r>
+    </w:p>
+    <w:p>
+      <w:pPr>
+        <w:pStyle w:val="FirstParagraph"/>
+      </w:pPr>
+      <w:r>
+        <w:rPr>
+          <w:b/>
+          <w:bCs/>
+        </w:rPr>
         <w:t xml:space="preserve">Keep in mind.</w:t>
       </w:r>
       <w:r>
@@ -2716,7 +3258,7 @@
         <w:t xml:space="preserve"> </w:t>
       </w:r>
       <w:r>
-        <w:t xml:space="preserve">obsidian.md/help/Files+and+folders/Manage+vaults (checked 2026-09-29); vault structure as of 2026-09-29.</w:t>
+        <w:t xml:space="preserve">obsidian.md/help/install and obsidian.md/help/manage-vaults (checked 2026-10-21); vault structure as of 2026-09-29.</w:t>
       </w:r>
     </w:p>
     <w:bookmarkEnd w:id="15"/>
@@ -2805,7 +3347,7 @@
         <w:pStyle w:val="Compact"/>
         <w:numPr>
           <w:ilvl w:val="0"/>
-          <w:numId w:val="1005"/>
+          <w:numId w:val="1006"/>
         </w:numPr>
       </w:pPr>
       <w:r>
@@ -2836,7 +3378,7 @@
         <w:pStyle w:val="Compact"/>
         <w:numPr>
           <w:ilvl w:val="0"/>
-          <w:numId w:val="1005"/>
+          <w:numId w:val="1006"/>
         </w:numPr>
       </w:pPr>
       <w:r>
@@ -2930,7 +3472,7 @@
         <w:pStyle w:val="Compact"/>
         <w:numPr>
           <w:ilvl w:val="0"/>
-          <w:numId w:val="1005"/>
+          <w:numId w:val="1006"/>
         </w:numPr>
       </w:pPr>
       <w:r>
@@ -2986,7 +3528,7 @@
         <w:pStyle w:val="Compact"/>
         <w:numPr>
           <w:ilvl w:val="0"/>
-          <w:numId w:val="1005"/>
+          <w:numId w:val="1006"/>
         </w:numPr>
       </w:pPr>
       <w:r>
@@ -3609,7 +4151,7 @@
       <w:pPr>
         <w:numPr>
           <w:ilvl w:val="0"/>
-          <w:numId w:val="1006"/>
+          <w:numId w:val="1007"/>
         </w:numPr>
       </w:pPr>
       <w:r>
@@ -3778,7 +4320,7 @@
       <w:pPr>
         <w:numPr>
           <w:ilvl w:val="0"/>
-          <w:numId w:val="1006"/>
+          <w:numId w:val="1007"/>
         </w:numPr>
       </w:pPr>
       <w:r>
@@ -3875,7 +4417,7 @@
       <w:pPr>
         <w:numPr>
           <w:ilvl w:val="0"/>
-          <w:numId w:val="1006"/>
+          <w:numId w:val="1007"/>
         </w:numPr>
       </w:pPr>
       <w:r>
@@ -4050,7 +4592,7 @@
       <w:pPr>
         <w:numPr>
           <w:ilvl w:val="0"/>
-          <w:numId w:val="1006"/>
+          <w:numId w:val="1007"/>
         </w:numPr>
       </w:pPr>
       <w:r>
@@ -4174,7 +4716,7 @@
       <w:pPr>
         <w:numPr>
           <w:ilvl w:val="0"/>
-          <w:numId w:val="1006"/>
+          <w:numId w:val="1007"/>
         </w:numPr>
       </w:pPr>
       <w:r>
@@ -4481,7 +5023,7 @@
       <w:pPr>
         <w:numPr>
           <w:ilvl w:val="0"/>
-          <w:numId w:val="1006"/>
+          <w:numId w:val="1007"/>
         </w:numPr>
       </w:pPr>
       <w:r>
@@ -4595,7 +5137,7 @@
       <w:pPr>
         <w:numPr>
           <w:ilvl w:val="0"/>
-          <w:numId w:val="1006"/>
+          <w:numId w:val="1007"/>
         </w:numPr>
       </w:pPr>
       <w:r>
@@ -4753,7 +5295,7 @@
       <w:pPr>
         <w:numPr>
           <w:ilvl w:val="0"/>
-          <w:numId w:val="1006"/>
+          <w:numId w:val="1007"/>
         </w:numPr>
       </w:pPr>
       <w:r>
@@ -4835,7 +5377,7 @@
       <w:pPr>
         <w:numPr>
           <w:ilvl w:val="0"/>
-          <w:numId w:val="1006"/>
+          <w:numId w:val="1007"/>
         </w:numPr>
       </w:pPr>
       <w:r>
@@ -4970,7 +5512,7 @@
       <w:pPr>
         <w:numPr>
           <w:ilvl w:val="0"/>
-          <w:numId w:val="1006"/>
+          <w:numId w:val="1007"/>
         </w:numPr>
       </w:pPr>
       <w:r>
@@ -5161,7 +5703,7 @@
         <w:pStyle w:val="Compact"/>
         <w:numPr>
           <w:ilvl w:val="0"/>
-          <w:numId w:val="1007"/>
+          <w:numId w:val="1008"/>
         </w:numPr>
       </w:pPr>
       <w:r>
@@ -5194,7 +5736,7 @@
         <w:pStyle w:val="Compact"/>
         <w:numPr>
           <w:ilvl w:val="0"/>
-          <w:numId w:val="1007"/>
+          <w:numId w:val="1008"/>
         </w:numPr>
       </w:pPr>
       <w:r>
@@ -5242,7 +5784,7 @@
         <w:pStyle w:val="Compact"/>
         <w:numPr>
           <w:ilvl w:val="0"/>
-          <w:numId w:val="1007"/>
+          <w:numId w:val="1008"/>
         </w:numPr>
       </w:pPr>
       <w:r>
@@ -5323,7 +5865,7 @@
         <w:pStyle w:val="Compact"/>
         <w:numPr>
           <w:ilvl w:val="0"/>
-          <w:numId w:val="1007"/>
+          <w:numId w:val="1008"/>
         </w:numPr>
       </w:pPr>
       <w:r>
@@ -5374,7 +5916,7 @@
         <w:pStyle w:val="Compact"/>
         <w:numPr>
           <w:ilvl w:val="0"/>
-          <w:numId w:val="1007"/>
+          <w:numId w:val="1008"/>
         </w:numPr>
       </w:pPr>
       <w:r>
@@ -5419,7 +5961,7 @@
         <w:pStyle w:val="Compact"/>
         <w:numPr>
           <w:ilvl w:val="0"/>
-          <w:numId w:val="1007"/>
+          <w:numId w:val="1008"/>
         </w:numPr>
       </w:pPr>
       <w:r>
@@ -5955,7 +6497,7 @@
       <w:pPr>
         <w:numPr>
           <w:ilvl w:val="0"/>
-          <w:numId w:val="1008"/>
+          <w:numId w:val="1009"/>
         </w:numPr>
       </w:pPr>
       <w:r>
@@ -5991,7 +6533,7 @@
       <w:pPr>
         <w:numPr>
           <w:ilvl w:val="0"/>
-          <w:numId w:val="1008"/>
+          <w:numId w:val="1009"/>
         </w:numPr>
       </w:pPr>
       <w:r>
@@ -6067,7 +6609,7 @@
       <w:pPr>
         <w:numPr>
           <w:ilvl w:val="0"/>
-          <w:numId w:val="1008"/>
+          <w:numId w:val="1009"/>
         </w:numPr>
       </w:pPr>
       <w:r>
@@ -6147,7 +6689,7 @@
       <w:pPr>
         <w:numPr>
           <w:ilvl w:val="0"/>
-          <w:numId w:val="1008"/>
+          <w:numId w:val="1009"/>
         </w:numPr>
       </w:pPr>
       <w:r>
@@ -6380,7 +6922,7 @@
       <w:pPr>
         <w:numPr>
           <w:ilvl w:val="0"/>
-          <w:numId w:val="1008"/>
+          <w:numId w:val="1009"/>
         </w:numPr>
       </w:pPr>
       <w:r>
@@ -6438,7 +6980,7 @@
       <w:pPr>
         <w:numPr>
           <w:ilvl w:val="0"/>
-          <w:numId w:val="1008"/>
+          <w:numId w:val="1009"/>
         </w:numPr>
       </w:pPr>
       <w:r>
@@ -6493,7 +7035,7 @@
       <w:pPr>
         <w:numPr>
           <w:ilvl w:val="0"/>
-          <w:numId w:val="1008"/>
+          <w:numId w:val="1009"/>
         </w:numPr>
       </w:pPr>
       <w:r>
@@ -6560,7 +7102,7 @@
       <w:pPr>
         <w:numPr>
           <w:ilvl w:val="0"/>
-          <w:numId w:val="1008"/>
+          <w:numId w:val="1009"/>
         </w:numPr>
       </w:pPr>
       <w:r>
@@ -7398,7 +7940,7 @@
       <w:pPr>
         <w:numPr>
           <w:ilvl w:val="0"/>
-          <w:numId w:val="1009"/>
+          <w:numId w:val="1010"/>
         </w:numPr>
       </w:pPr>
       <w:r>
@@ -7518,7 +8060,7 @@
       <w:pPr>
         <w:numPr>
           <w:ilvl w:val="0"/>
-          <w:numId w:val="1009"/>
+          <w:numId w:val="1010"/>
         </w:numPr>
       </w:pPr>
       <w:r>
@@ -7539,7 +8081,7 @@
       <w:pPr>
         <w:numPr>
           <w:ilvl w:val="0"/>
-          <w:numId w:val="1009"/>
+          <w:numId w:val="1010"/>
         </w:numPr>
       </w:pPr>
       <w:r>
@@ -7798,7 +8340,7 @@
       <w:pPr>
         <w:numPr>
           <w:ilvl w:val="0"/>
-          <w:numId w:val="1009"/>
+          <w:numId w:val="1010"/>
         </w:numPr>
       </w:pPr>
       <w:r>
@@ -7820,7 +8362,7 @@
         <w:pStyle w:val="Compact"/>
         <w:numPr>
           <w:ilvl w:val="1"/>
-          <w:numId w:val="1010"/>
+          <w:numId w:val="1011"/>
         </w:numPr>
       </w:pPr>
       <w:r>
@@ -7845,7 +8387,7 @@
         <w:pStyle w:val="Compact"/>
         <w:numPr>
           <w:ilvl w:val="1"/>
-          <w:numId w:val="1010"/>
+          <w:numId w:val="1011"/>
         </w:numPr>
       </w:pPr>
       <w:r>
@@ -7926,7 +8468,7 @@
         <w:pStyle w:val="Compact"/>
         <w:numPr>
           <w:ilvl w:val="1"/>
-          <w:numId w:val="1010"/>
+          <w:numId w:val="1011"/>
         </w:numPr>
       </w:pPr>
       <w:r>
@@ -7958,127 +8500,127 @@
     <w:p>
       <w:pPr>
         <w:pStyle w:val="Compact"/>
-        <w:numPr>
-          <w:ilvl w:val="1"/>
-          <w:numId w:val="1010"/>
-        </w:numPr>
-      </w:pPr>
-      <w:r>
-        <w:t xml:space="preserve">With</w:t>
-      </w:r>
-      <w:r>
-        <w:t xml:space="preserve"> </w:t>
-      </w:r>
-      <w:r>
-        <w:rPr>
-          <w:rStyle w:val="VerbatimChar"/>
-        </w:rPr>
-        <w:t xml:space="preserve">jev@jev-mcp</w:t>
-      </w:r>
-      <w:r>
-        <w:t xml:space="preserve">, use</w:t>
-      </w:r>
-      <w:r>
-        <w:t xml:space="preserve"> </w:t>
-      </w:r>
-      <w:r>
-        <w:rPr>
-          <w:rStyle w:val="VerbatimChar"/>
-        </w:rPr>
-        <w:t xml:space="preserve">/mcp</w:t>
-      </w:r>
-      <w:r>
-        <w:t xml:space="preserve"> </w:t>
-      </w:r>
-      <w:r>
-        <w:t xml:space="preserve">and step 7 above instead.</w:t>
-      </w:r>
-    </w:p>
-    <w:p>
-      <w:pPr>
-        <w:numPr>
-          <w:ilvl w:val="0"/>
-          <w:numId w:val="1009"/>
-        </w:numPr>
-      </w:pPr>
-      <w:r>
-        <w:rPr>
-          <w:b/>
-          <w:bCs/>
-        </w:rPr>
-        <w:t xml:space="preserve">Stay in shadow mode at first</w:t>
-      </w:r>
-      <w:r>
-        <w:t xml:space="preserve"> </w:t>
-      </w:r>
-      <w:r>
-        <w:t xml:space="preserve">(inside Claude Code). In shadow mode Jev records its decisions but does not change Claude Code’s permission prompts. Commands and their outputs may be sent to TypeSafe. Do not let Jev control permissions for work involving confidential, student-identifiable or institutional data until you have decided what may be sent.</w:t>
-      </w:r>
-    </w:p>
-    <w:p>
-      <w:pPr>
-        <w:numPr>
-          <w:ilvl w:val="0"/>
-          <w:numId w:val="1009"/>
-        </w:numPr>
-      </w:pPr>
-      <w:r>
-        <w:rPr>
-          <w:b/>
-          <w:bCs/>
-        </w:rPr>
-        <w:t xml:space="preserve">Tried, not enough:</w:t>
-      </w:r>
-      <w:r>
-        <w:rPr>
-          <w:b/>
-          <w:bCs/>
-        </w:rPr>
-        <w:t xml:space="preserve"> </w:t>
-      </w:r>
-      <w:r>
-        <w:rPr>
-          <w:b/>
-          <w:bCs/>
-        </w:rPr>
-        <w:t xml:space="preserve">“Window: Restore Windows = all”</w:t>
-      </w:r>
-      <w:r>
-        <w:t xml:space="preserve"> </w:t>
-      </w:r>
-      <w:r>
-        <w:t xml:space="preserve">(VS Code settings). VS Code reopened its windows, but the vault came back in Windows with a PowerShell prompt, not in WSL.</w:t>
-      </w:r>
-    </w:p>
-    <w:p>
-      <w:pPr>
-        <w:numPr>
-          <w:ilvl w:val="0"/>
-          <w:numId w:val="1009"/>
-        </w:numPr>
-      </w:pPr>
-      <w:r>
-        <w:rPr>
-          <w:b/>
-          <w:bCs/>
-        </w:rPr>
-        <w:t xml:space="preserve">Open WSL with one click: a desktop shortcut</w:t>
-      </w:r>
-      <w:r>
-        <w:t xml:space="preserve"> </w:t>
-      </w:r>
-      <w:r>
-        <w:t xml:space="preserve">(Windows).</w:t>
-      </w:r>
-    </w:p>
-    <w:p>
-      <w:pPr>
         <w:numPr>
           <w:ilvl w:val="1"/>
           <w:numId w:val="1011"/>
         </w:numPr>
       </w:pPr>
       <w:r>
+        <w:t xml:space="preserve">With</w:t>
+      </w:r>
+      <w:r>
+        <w:t xml:space="preserve"> </w:t>
+      </w:r>
+      <w:r>
+        <w:rPr>
+          <w:rStyle w:val="VerbatimChar"/>
+        </w:rPr>
+        <w:t xml:space="preserve">jev@jev-mcp</w:t>
+      </w:r>
+      <w:r>
+        <w:t xml:space="preserve">, use</w:t>
+      </w:r>
+      <w:r>
+        <w:t xml:space="preserve"> </w:t>
+      </w:r>
+      <w:r>
+        <w:rPr>
+          <w:rStyle w:val="VerbatimChar"/>
+        </w:rPr>
+        <w:t xml:space="preserve">/mcp</w:t>
+      </w:r>
+      <w:r>
+        <w:t xml:space="preserve"> </w:t>
+      </w:r>
+      <w:r>
+        <w:t xml:space="preserve">and step 7 above instead.</w:t>
+      </w:r>
+    </w:p>
+    <w:p>
+      <w:pPr>
+        <w:numPr>
+          <w:ilvl w:val="0"/>
+          <w:numId w:val="1010"/>
+        </w:numPr>
+      </w:pPr>
+      <w:r>
+        <w:rPr>
+          <w:b/>
+          <w:bCs/>
+        </w:rPr>
+        <w:t xml:space="preserve">Stay in shadow mode at first</w:t>
+      </w:r>
+      <w:r>
+        <w:t xml:space="preserve"> </w:t>
+      </w:r>
+      <w:r>
+        <w:t xml:space="preserve">(inside Claude Code). In shadow mode Jev records its decisions but does not change Claude Code’s permission prompts. Commands and their outputs may be sent to TypeSafe. Do not let Jev control permissions for work involving confidential, student-identifiable or institutional data until you have decided what may be sent.</w:t>
+      </w:r>
+    </w:p>
+    <w:p>
+      <w:pPr>
+        <w:numPr>
+          <w:ilvl w:val="0"/>
+          <w:numId w:val="1010"/>
+        </w:numPr>
+      </w:pPr>
+      <w:r>
+        <w:rPr>
+          <w:b/>
+          <w:bCs/>
+        </w:rPr>
+        <w:t xml:space="preserve">Tried, not enough:</w:t>
+      </w:r>
+      <w:r>
+        <w:rPr>
+          <w:b/>
+          <w:bCs/>
+        </w:rPr>
+        <w:t xml:space="preserve"> </w:t>
+      </w:r>
+      <w:r>
+        <w:rPr>
+          <w:b/>
+          <w:bCs/>
+        </w:rPr>
+        <w:t xml:space="preserve">“Window: Restore Windows = all”</w:t>
+      </w:r>
+      <w:r>
+        <w:t xml:space="preserve"> </w:t>
+      </w:r>
+      <w:r>
+        <w:t xml:space="preserve">(VS Code settings). VS Code reopened its windows, but the vault came back in Windows with a PowerShell prompt, not in WSL.</w:t>
+      </w:r>
+    </w:p>
+    <w:p>
+      <w:pPr>
+        <w:numPr>
+          <w:ilvl w:val="0"/>
+          <w:numId w:val="1010"/>
+        </w:numPr>
+      </w:pPr>
+      <w:r>
+        <w:rPr>
+          <w:b/>
+          <w:bCs/>
+        </w:rPr>
+        <w:t xml:space="preserve">Open WSL with one click: a desktop shortcut</w:t>
+      </w:r>
+      <w:r>
+        <w:t xml:space="preserve"> </w:t>
+      </w:r>
+      <w:r>
+        <w:t xml:space="preserve">(Windows).</w:t>
+      </w:r>
+    </w:p>
+    <w:p>
+      <w:pPr>
+        <w:numPr>
+          <w:ilvl w:val="1"/>
+          <w:numId w:val="1012"/>
+        </w:numPr>
+      </w:pPr>
+      <w:r>
         <w:t xml:space="preserve">Right-click the desktop →</w:t>
       </w:r>
       <w:r>
@@ -8099,7 +8641,7 @@
       <w:pPr>
         <w:numPr>
           <w:ilvl w:val="1"/>
-          <w:numId w:val="1011"/>
+          <w:numId w:val="1012"/>
         </w:numPr>
       </w:pPr>
       <w:r>
@@ -8125,7 +8667,7 @@
       <w:pPr>
         <w:numPr>
           <w:ilvl w:val="1"/>
-          <w:numId w:val="1011"/>
+          <w:numId w:val="1012"/>
         </w:numPr>
       </w:pPr>
       <w:r>
@@ -8149,7 +8691,7 @@
       <w:pPr>
         <w:numPr>
           <w:ilvl w:val="1"/>
-          <w:numId w:val="1011"/>
+          <w:numId w:val="1012"/>
         </w:numPr>
       </w:pPr>
       <w:r>
@@ -8185,7 +8727,7 @@
       <w:pPr>
         <w:numPr>
           <w:ilvl w:val="0"/>
-          <w:numId w:val="1009"/>
+          <w:numId w:val="1010"/>
         </w:numPr>
       </w:pPr>
       <w:r>
@@ -8582,7 +9124,7 @@
         <w:pStyle w:val="Compact"/>
         <w:numPr>
           <w:ilvl w:val="0"/>
-          <w:numId w:val="1012"/>
+          <w:numId w:val="1013"/>
         </w:numPr>
       </w:pPr>
       <w:r>
@@ -8708,7 +9250,7 @@
         <w:pStyle w:val="Compact"/>
         <w:numPr>
           <w:ilvl w:val="0"/>
-          <w:numId w:val="1012"/>
+          <w:numId w:val="1013"/>
         </w:numPr>
       </w:pPr>
       <w:r>
@@ -8810,7 +9352,7 @@
         <w:pStyle w:val="Compact"/>
         <w:numPr>
           <w:ilvl w:val="0"/>
-          <w:numId w:val="1012"/>
+          <w:numId w:val="1013"/>
         </w:numPr>
       </w:pPr>
       <w:r>
@@ -8926,7 +9468,7 @@
         <w:pStyle w:val="Compact"/>
         <w:numPr>
           <w:ilvl w:val="0"/>
-          <w:numId w:val="1013"/>
+          <w:numId w:val="1014"/>
         </w:numPr>
       </w:pPr>
       <w:r>
@@ -8970,7 +9512,7 @@
         <w:pStyle w:val="Compact"/>
         <w:numPr>
           <w:ilvl w:val="0"/>
-          <w:numId w:val="1013"/>
+          <w:numId w:val="1014"/>
         </w:numPr>
       </w:pPr>
       <w:r>
@@ -9014,7 +9556,7 @@
         <w:pStyle w:val="Compact"/>
         <w:numPr>
           <w:ilvl w:val="0"/>
-          <w:numId w:val="1013"/>
+          <w:numId w:val="1014"/>
         </w:numPr>
       </w:pPr>
       <w:r>
@@ -9089,7 +9631,7 @@
         <w:pStyle w:val="Compact"/>
         <w:numPr>
           <w:ilvl w:val="0"/>
-          <w:numId w:val="1013"/>
+          <w:numId w:val="1014"/>
         </w:numPr>
       </w:pPr>
       <w:r>
@@ -9149,7 +9691,7 @@
         <w:pStyle w:val="Compact"/>
         <w:numPr>
           <w:ilvl w:val="0"/>
-          <w:numId w:val="1013"/>
+          <w:numId w:val="1014"/>
         </w:numPr>
       </w:pPr>
       <w:r>
@@ -9465,7 +10007,7 @@
         <w:pStyle w:val="Compact"/>
         <w:numPr>
           <w:ilvl w:val="0"/>
-          <w:numId w:val="1014"/>
+          <w:numId w:val="1015"/>
         </w:numPr>
       </w:pPr>
       <w:r>
@@ -9522,7 +10064,7 @@
         <w:pStyle w:val="Compact"/>
         <w:numPr>
           <w:ilvl w:val="0"/>
-          <w:numId w:val="1014"/>
+          <w:numId w:val="1015"/>
         </w:numPr>
       </w:pPr>
       <w:r>
@@ -9576,7 +10118,7 @@
         <w:pStyle w:val="Compact"/>
         <w:numPr>
           <w:ilvl w:val="0"/>
-          <w:numId w:val="1014"/>
+          <w:numId w:val="1015"/>
         </w:numPr>
       </w:pPr>
       <w:r>
@@ -9623,7 +10165,7 @@
         <w:pStyle w:val="Compact"/>
         <w:numPr>
           <w:ilvl w:val="0"/>
-          <w:numId w:val="1014"/>
+          <w:numId w:val="1015"/>
         </w:numPr>
       </w:pPr>
       <w:r>
@@ -9737,7 +10279,7 @@
         <w:pStyle w:val="Compact"/>
         <w:numPr>
           <w:ilvl w:val="0"/>
-          <w:numId w:val="1015"/>
+          <w:numId w:val="1016"/>
         </w:numPr>
       </w:pPr>
       <w:r>
@@ -9759,7 +10301,7 @@
         <w:pStyle w:val="Compact"/>
         <w:numPr>
           <w:ilvl w:val="0"/>
-          <w:numId w:val="1015"/>
+          <w:numId w:val="1016"/>
         </w:numPr>
       </w:pPr>
       <w:r>
@@ -9828,7 +10370,7 @@
         <w:pStyle w:val="Compact"/>
         <w:numPr>
           <w:ilvl w:val="0"/>
-          <w:numId w:val="1015"/>
+          <w:numId w:val="1016"/>
         </w:numPr>
       </w:pPr>
       <w:r>
@@ -9916,7 +10458,7 @@
         <w:pStyle w:val="Compact"/>
         <w:numPr>
           <w:ilvl w:val="0"/>
-          <w:numId w:val="1015"/>
+          <w:numId w:val="1016"/>
         </w:numPr>
       </w:pPr>
       <w:r>
@@ -9996,7 +10538,7 @@
         <w:pStyle w:val="Compact"/>
         <w:numPr>
           <w:ilvl w:val="0"/>
-          <w:numId w:val="1015"/>
+          <w:numId w:val="1016"/>
         </w:numPr>
       </w:pPr>
       <w:r>
@@ -10062,7 +10604,7 @@
         <w:pStyle w:val="Compact"/>
         <w:numPr>
           <w:ilvl w:val="0"/>
-          <w:numId w:val="1016"/>
+          <w:numId w:val="1017"/>
         </w:numPr>
       </w:pPr>
       <w:r>
@@ -10090,7 +10632,7 @@
         <w:pStyle w:val="Compact"/>
         <w:numPr>
           <w:ilvl w:val="0"/>
-          <w:numId w:val="1016"/>
+          <w:numId w:val="1017"/>
         </w:numPr>
       </w:pPr>
       <w:r>
@@ -10128,7 +10670,7 @@
         <w:pStyle w:val="Compact"/>
         <w:numPr>
           <w:ilvl w:val="0"/>
-          <w:numId w:val="1016"/>
+          <w:numId w:val="1017"/>
         </w:numPr>
       </w:pPr>
       <w:r>
@@ -10296,7 +10838,7 @@
         <w:pStyle w:val="Compact"/>
         <w:numPr>
           <w:ilvl w:val="0"/>
-          <w:numId w:val="1017"/>
+          <w:numId w:val="1018"/>
         </w:numPr>
       </w:pPr>
       <w:r>
@@ -10360,7 +10902,7 @@
         <w:pStyle w:val="Compact"/>
         <w:numPr>
           <w:ilvl w:val="0"/>
-          <w:numId w:val="1017"/>
+          <w:numId w:val="1018"/>
         </w:numPr>
       </w:pPr>
       <w:r>
@@ -10417,7 +10959,7 @@
         <w:pStyle w:val="Compact"/>
         <w:numPr>
           <w:ilvl w:val="0"/>
-          <w:numId w:val="1017"/>
+          <w:numId w:val="1018"/>
         </w:numPr>
       </w:pPr>
       <w:r>
@@ -10473,7 +11015,7 @@
         <w:pStyle w:val="Compact"/>
         <w:numPr>
           <w:ilvl w:val="0"/>
-          <w:numId w:val="1017"/>
+          <w:numId w:val="1018"/>
         </w:numPr>
       </w:pPr>
       <w:r>
@@ -10529,7 +11071,7 @@
         <w:pStyle w:val="Compact"/>
         <w:numPr>
           <w:ilvl w:val="0"/>
-          <w:numId w:val="1017"/>
+          <w:numId w:val="1018"/>
         </w:numPr>
       </w:pPr>
       <w:r>
@@ -10965,7 +11507,7 @@
       <w:pPr>
         <w:numPr>
           <w:ilvl w:val="0"/>
-          <w:numId w:val="1018"/>
+          <w:numId w:val="1019"/>
         </w:numPr>
       </w:pPr>
       <w:r>
@@ -11025,7 +11567,7 @@
       <w:pPr>
         <w:numPr>
           <w:ilvl w:val="0"/>
-          <w:numId w:val="1018"/>
+          <w:numId w:val="1019"/>
         </w:numPr>
       </w:pPr>
       <w:r>
@@ -11118,7 +11660,7 @@
       <w:pPr>
         <w:numPr>
           <w:ilvl w:val="0"/>
-          <w:numId w:val="1018"/>
+          <w:numId w:val="1019"/>
         </w:numPr>
       </w:pPr>
       <w:r>
@@ -11277,7 +11819,7 @@
       <w:pPr>
         <w:numPr>
           <w:ilvl w:val="0"/>
-          <w:numId w:val="1018"/>
+          <w:numId w:val="1019"/>
         </w:numPr>
       </w:pPr>
       <w:r>
@@ -11513,7 +12055,7 @@
       <w:pPr>
         <w:numPr>
           <w:ilvl w:val="0"/>
-          <w:numId w:val="1018"/>
+          <w:numId w:val="1019"/>
         </w:numPr>
       </w:pPr>
       <w:r>
@@ -11751,7 +12293,7 @@
         <w:pStyle w:val="Compact"/>
         <w:numPr>
           <w:ilvl w:val="0"/>
-          <w:numId w:val="1019"/>
+          <w:numId w:val="1020"/>
         </w:numPr>
       </w:pPr>
       <w:r>
@@ -11820,7 +12362,7 @@
         <w:pStyle w:val="Compact"/>
         <w:numPr>
           <w:ilvl w:val="0"/>
-          <w:numId w:val="1019"/>
+          <w:numId w:val="1020"/>
         </w:numPr>
       </w:pPr>
       <w:r>
@@ -11881,7 +12423,7 @@
         <w:pStyle w:val="Compact"/>
         <w:numPr>
           <w:ilvl w:val="0"/>
-          <w:numId w:val="1019"/>
+          <w:numId w:val="1020"/>
         </w:numPr>
       </w:pPr>
       <w:r>
@@ -11940,7 +12482,7 @@
         <w:pStyle w:val="Compact"/>
         <w:numPr>
           <w:ilvl w:val="0"/>
-          <w:numId w:val="1019"/>
+          <w:numId w:val="1020"/>
         </w:numPr>
       </w:pPr>
       <w:r>
@@ -11972,7 +12514,7 @@
         <w:pStyle w:val="Compact"/>
         <w:numPr>
           <w:ilvl w:val="0"/>
-          <w:numId w:val="1019"/>
+          <w:numId w:val="1020"/>
         </w:numPr>
       </w:pPr>
       <w:r>
@@ -12097,7 +12639,7 @@
         <w:pStyle w:val="Compact"/>
         <w:numPr>
           <w:ilvl w:val="0"/>
-          <w:numId w:val="1020"/>
+          <w:numId w:val="1021"/>
         </w:numPr>
       </w:pPr>
       <w:r>
@@ -12126,48 +12668,6 @@
       </w:r>
       <w:r>
         <w:t xml:space="preserve">is clean</w:t>
-      </w:r>
-    </w:p>
-    <w:p>
-      <w:pPr>
-        <w:pStyle w:val="Compact"/>
-        <w:numPr>
-          <w:ilvl w:val="0"/>
-          <w:numId w:val="1021"/>
-        </w:numPr>
-      </w:pPr>
-      <w:r>
-        <w:t xml:space="preserve">The vault opens in Obsidian;</w:t>
-      </w:r>
-      <w:r>
-        <w:t xml:space="preserve"> </w:t>
-      </w:r>
-      <w:r>
-        <w:rPr>
-          <w:rStyle w:val="VerbatimChar"/>
-        </w:rPr>
-        <w:t xml:space="preserve">CLAUDE.md</w:t>
-      </w:r>
-      <w:r>
-        <w:t xml:space="preserve"> </w:t>
-      </w:r>
-      <w:r>
-        <w:t xml:space="preserve">and</w:t>
-      </w:r>
-      <w:r>
-        <w:t xml:space="preserve"> </w:t>
-      </w:r>
-      <w:r>
-        <w:rPr>
-          <w:rStyle w:val="VerbatimChar"/>
-        </w:rPr>
-        <w:t xml:space="preserve">RESEARCH_PROTOCOL.md</w:t>
-      </w:r>
-      <w:r>
-        <w:t xml:space="preserve"> </w:t>
-      </w:r>
-      <w:r>
-        <w:t xml:space="preserve">exist</w:t>
       </w:r>
     </w:p>
     <w:p>
@@ -12179,31 +12679,37 @@
         </w:numPr>
       </w:pPr>
       <w:r>
-        <w:rPr>
-          <w:rStyle w:val="VerbatimChar"/>
-        </w:rPr>
-        <w:t xml:space="preserve">git log</w:t>
-      </w:r>
-      <w:r>
-        <w:t xml:space="preserve"> </w:t>
-      </w:r>
-      <w:r>
-        <w:t xml:space="preserve">shows history;</w:t>
-      </w:r>
-      <w:r>
-        <w:t xml:space="preserve"> </w:t>
-      </w:r>
-      <w:r>
-        <w:rPr>
-          <w:rStyle w:val="VerbatimChar"/>
-        </w:rPr>
-        <w:t xml:space="preserve">git check-ignore</w:t>
-      </w:r>
-      <w:r>
-        <w:t xml:space="preserve"> </w:t>
-      </w:r>
-      <w:r>
-        <w:t xml:space="preserve">confirms every key file is ignored</w:t>
+        <w:t xml:space="preserve">The vault opens in Obsidian; a note Claude writes appears there;</w:t>
+      </w:r>
+      <w:r>
+        <w:t xml:space="preserve"> </w:t>
+      </w:r>
+      <w:r>
+        <w:rPr>
+          <w:rStyle w:val="VerbatimChar"/>
+        </w:rPr>
+        <w:t xml:space="preserve">CLAUDE.md</w:t>
+      </w:r>
+      <w:r>
+        <w:t xml:space="preserve"> </w:t>
+      </w:r>
+      <w:r>
+        <w:t xml:space="preserve">and</w:t>
+      </w:r>
+      <w:r>
+        <w:t xml:space="preserve"> </w:t>
+      </w:r>
+      <w:r>
+        <w:rPr>
+          <w:rStyle w:val="VerbatimChar"/>
+        </w:rPr>
+        <w:t xml:space="preserve">RESEARCH_PROTOCOL.md</w:t>
+      </w:r>
+      <w:r>
+        <w:t xml:space="preserve"> </w:t>
+      </w:r>
+      <w:r>
+        <w:t xml:space="preserve">exist</w:t>
       </w:r>
     </w:p>
     <w:p>
@@ -12218,37 +12724,28 @@
         <w:rPr>
           <w:rStyle w:val="VerbatimChar"/>
         </w:rPr>
-        <w:t xml:space="preserve">process-source.py --doctor</w:t>
-      </w:r>
-      <w:r>
-        <w:t xml:space="preserve"> </w:t>
-      </w:r>
-      <w:r>
-        <w:t xml:space="preserve">ends with</w:t>
-      </w:r>
-      <w:r>
-        <w:t xml:space="preserve"> </w:t>
-      </w:r>
-      <w:r>
-        <w:t xml:space="preserve">“All dependencies available”</w:t>
-      </w:r>
-      <w:r>
-        <w:t xml:space="preserve">;</w:t>
-      </w:r>
-      <w:r>
-        <w:t xml:space="preserve"> </w:t>
-      </w:r>
-      <w:r>
-        <w:rPr>
-          <w:rStyle w:val="VerbatimChar"/>
-        </w:rPr>
-        <w:t xml:space="preserve">pandoc --version</w:t>
-      </w:r>
-      <w:r>
-        <w:t xml:space="preserve"> </w:t>
-      </w:r>
-      <w:r>
-        <w:t xml:space="preserve">works</w:t>
+        <w:t xml:space="preserve">git log</w:t>
+      </w:r>
+      <w:r>
+        <w:t xml:space="preserve"> </w:t>
+      </w:r>
+      <w:r>
+        <w:t xml:space="preserve">shows history;</w:t>
+      </w:r>
+      <w:r>
+        <w:t xml:space="preserve"> </w:t>
+      </w:r>
+      <w:r>
+        <w:rPr>
+          <w:rStyle w:val="VerbatimChar"/>
+        </w:rPr>
+        <w:t xml:space="preserve">git check-ignore</w:t>
+      </w:r>
+      <w:r>
+        <w:t xml:space="preserve"> </w:t>
+      </w:r>
+      <w:r>
+        <w:t xml:space="preserve">confirms every key file is ignored</w:t>
       </w:r>
     </w:p>
     <w:p>
@@ -12263,43 +12760,37 @@
         <w:rPr>
           <w:rStyle w:val="VerbatimChar"/>
         </w:rPr>
-        <w:t xml:space="preserve">/mcp</w:t>
-      </w:r>
-      <w:r>
-        <w:t xml:space="preserve"> </w:t>
-      </w:r>
-      <w:r>
-        <w:t xml:space="preserve">shows</w:t>
-      </w:r>
-      <w:r>
-        <w:t xml:space="preserve"> </w:t>
-      </w:r>
-      <w:r>
-        <w:rPr>
-          <w:rStyle w:val="VerbatimChar"/>
-        </w:rPr>
-        <w:t xml:space="preserve">plugin:jev:jev</w:t>
-      </w:r>
-      <w:r>
-        <w:t xml:space="preserve"> </w:t>
-      </w:r>
-      <w:r>
-        <w:t xml:space="preserve">with six tools;</w:t>
-      </w:r>
-      <w:r>
-        <w:t xml:space="preserve"> </w:t>
-      </w:r>
-      <w:r>
-        <w:rPr>
-          <w:rStyle w:val="VerbatimChar"/>
-        </w:rPr>
-        <w:t xml:space="preserve">jev_models</w:t>
-      </w:r>
-      <w:r>
-        <w:t xml:space="preserve"> </w:t>
-      </w:r>
-      <w:r>
-        <w:t xml:space="preserve">succeeds</w:t>
+        <w:t xml:space="preserve">process-source.py --doctor</w:t>
+      </w:r>
+      <w:r>
+        <w:t xml:space="preserve"> </w:t>
+      </w:r>
+      <w:r>
+        <w:t xml:space="preserve">ends with</w:t>
+      </w:r>
+      <w:r>
+        <w:t xml:space="preserve"> </w:t>
+      </w:r>
+      <w:r>
+        <w:t xml:space="preserve">“All dependencies available”</w:t>
+      </w:r>
+      <w:r>
+        <w:t xml:space="preserve">;</w:t>
+      </w:r>
+      <w:r>
+        <w:t xml:space="preserve"> </w:t>
+      </w:r>
+      <w:r>
+        <w:rPr>
+          <w:rStyle w:val="VerbatimChar"/>
+        </w:rPr>
+        <w:t xml:space="preserve">pandoc --version</w:t>
+      </w:r>
+      <w:r>
+        <w:t xml:space="preserve"> </w:t>
+      </w:r>
+      <w:r>
+        <w:t xml:space="preserve">works</w:t>
       </w:r>
     </w:p>
     <w:p>
@@ -12314,13 +12805,43 @@
         <w:rPr>
           <w:rStyle w:val="VerbatimChar"/>
         </w:rPr>
-        <w:t xml:space="preserve">claude plugin list</w:t>
-      </w:r>
-      <w:r>
-        <w:t xml:space="preserve"> </w:t>
-      </w:r>
-      <w:r>
-        <w:t xml:space="preserve">shows each plugin once</w:t>
+        <w:t xml:space="preserve">/mcp</w:t>
+      </w:r>
+      <w:r>
+        <w:t xml:space="preserve"> </w:t>
+      </w:r>
+      <w:r>
+        <w:t xml:space="preserve">shows</w:t>
+      </w:r>
+      <w:r>
+        <w:t xml:space="preserve"> </w:t>
+      </w:r>
+      <w:r>
+        <w:rPr>
+          <w:rStyle w:val="VerbatimChar"/>
+        </w:rPr>
+        <w:t xml:space="preserve">plugin:jev:jev</w:t>
+      </w:r>
+      <w:r>
+        <w:t xml:space="preserve"> </w:t>
+      </w:r>
+      <w:r>
+        <w:t xml:space="preserve">with six tools;</w:t>
+      </w:r>
+      <w:r>
+        <w:t xml:space="preserve"> </w:t>
+      </w:r>
+      <w:r>
+        <w:rPr>
+          <w:rStyle w:val="VerbatimChar"/>
+        </w:rPr>
+        <w:t xml:space="preserve">jev_models</w:t>
+      </w:r>
+      <w:r>
+        <w:t xml:space="preserve"> </w:t>
+      </w:r>
+      <w:r>
+        <w:t xml:space="preserve">succeeds</w:t>
       </w:r>
     </w:p>
     <w:p>
@@ -12335,31 +12856,13 @@
         <w:rPr>
           <w:rStyle w:val="VerbatimChar"/>
         </w:rPr>
-        <w:t xml:space="preserve">/chrome</w:t>
-      </w:r>
-      <w:r>
-        <w:t xml:space="preserve"> </w:t>
-      </w:r>
-      <w:r>
-        <w:t xml:space="preserve">shows</w:t>
-      </w:r>
-      <w:r>
-        <w:t xml:space="preserve"> </w:t>
-      </w:r>
-      <w:r>
-        <w:t xml:space="preserve">“Status: Enabled”</w:t>
-      </w:r>
-      <w:r>
-        <w:t xml:space="preserve"> </w:t>
-      </w:r>
-      <w:r>
-        <w:t xml:space="preserve">and</w:t>
-      </w:r>
-      <w:r>
-        <w:t xml:space="preserve"> </w:t>
-      </w:r>
-      <w:r>
-        <w:t xml:space="preserve">“Extension: Installed”</w:t>
+        <w:t xml:space="preserve">claude plugin list</w:t>
+      </w:r>
+      <w:r>
+        <w:t xml:space="preserve"> </w:t>
+      </w:r>
+      <w:r>
+        <w:t xml:space="preserve">shows each plugin once</w:t>
       </w:r>
     </w:p>
     <w:p>
@@ -12371,7 +12874,34 @@
         </w:numPr>
       </w:pPr>
       <w:r>
-        <w:t xml:space="preserve">Only the Google connectors you need are authorised</w:t>
+        <w:rPr>
+          <w:rStyle w:val="VerbatimChar"/>
+        </w:rPr>
+        <w:t xml:space="preserve">/chrome</w:t>
+      </w:r>
+      <w:r>
+        <w:t xml:space="preserve"> </w:t>
+      </w:r>
+      <w:r>
+        <w:t xml:space="preserve">shows</w:t>
+      </w:r>
+      <w:r>
+        <w:t xml:space="preserve"> </w:t>
+      </w:r>
+      <w:r>
+        <w:t xml:space="preserve">“Status: Enabled”</w:t>
+      </w:r>
+      <w:r>
+        <w:t xml:space="preserve"> </w:t>
+      </w:r>
+      <w:r>
+        <w:t xml:space="preserve">and</w:t>
+      </w:r>
+      <w:r>
+        <w:t xml:space="preserve"> </w:t>
+      </w:r>
+      <w:r>
+        <w:t xml:space="preserve">“Extension: Installed”</w:t>
       </w:r>
     </w:p>
     <w:p>
@@ -12383,7 +12913,7 @@
         </w:numPr>
       </w:pPr>
       <w:r>
-        <w:t xml:space="preserve">NotebookLM opens through Claude in Chrome; outputs saved as derived material</w:t>
+        <w:t xml:space="preserve">Only the Google connectors you need are authorised</w:t>
       </w:r>
     </w:p>
     <w:p>
@@ -12395,16 +12925,7 @@
         </w:numPr>
       </w:pPr>
       <w:r>
-        <w:rPr>
-          <w:rStyle w:val="VerbatimChar"/>
-        </w:rPr>
-        <w:t xml:space="preserve">/zotero-sources doctor</w:t>
-      </w:r>
-      <w:r>
-        <w:t xml:space="preserve"> </w:t>
-      </w:r>
-      <w:r>
-        <w:t xml:space="preserve">passes (Zotero open, local API enabled)</w:t>
+        <w:t xml:space="preserve">NotebookLM opens through Claude in Chrome; outputs saved as derived material</w:t>
       </w:r>
     </w:p>
     <w:p>
@@ -12416,22 +12937,16 @@
         </w:numPr>
       </w:pPr>
       <w:r>
-        <w:t xml:space="preserve">Zotero write key verified via</w:t>
-      </w:r>
-      <w:r>
-        <w:t xml:space="preserve"> </w:t>
-      </w:r>
-      <w:r>
-        <w:rPr>
-          <w:rStyle w:val="VerbatimChar"/>
-        </w:rPr>
-        <w:t xml:space="preserve">api.zotero.org/keys/…</w:t>
-      </w:r>
-      <w:r>
-        <w:t xml:space="preserve"> </w:t>
-      </w:r>
-      <w:r>
-        <w:t xml:space="preserve">(only if you use write-back)</w:t>
+        <w:rPr>
+          <w:rStyle w:val="VerbatimChar"/>
+        </w:rPr>
+        <w:t xml:space="preserve">/zotero-sources doctor</w:t>
+      </w:r>
+      <w:r>
+        <w:t xml:space="preserve"> </w:t>
+      </w:r>
+      <w:r>
+        <w:t xml:space="preserve">passes (Zotero open, local API enabled)</w:t>
       </w:r>
     </w:p>
     <w:p>
@@ -12440,6 +12955,33 @@
         <w:numPr>
           <w:ilvl w:val="0"/>
           <w:numId w:val="1031"/>
+        </w:numPr>
+      </w:pPr>
+      <w:r>
+        <w:t xml:space="preserve">Zotero write key verified via</w:t>
+      </w:r>
+      <w:r>
+        <w:t xml:space="preserve"> </w:t>
+      </w:r>
+      <w:r>
+        <w:rPr>
+          <w:rStyle w:val="VerbatimChar"/>
+        </w:rPr>
+        <w:t xml:space="preserve">api.zotero.org/keys/…</w:t>
+      </w:r>
+      <w:r>
+        <w:t xml:space="preserve"> </w:t>
+      </w:r>
+      <w:r>
+        <w:t xml:space="preserve">(only if you use write-back)</w:t>
+      </w:r>
+    </w:p>
+    <w:p>
+      <w:pPr>
+        <w:pStyle w:val="Compact"/>
+        <w:numPr>
+          <w:ilvl w:val="0"/>
+          <w:numId w:val="1032"/>
         </w:numPr>
       </w:pPr>
       <w:r>
@@ -12997,34 +13539,7 @@
     </w:lvlOverride>
   </w:num>
   <w:num w:numId="1005">
-    <w:abstractNumId w:val="99411"/>
-    <w:lvlOverride w:ilvl="0">
-      <w:startOverride w:val="1"/>
-    </w:lvlOverride>
-    <w:lvlOverride w:ilvl="1">
-      <w:startOverride w:val="1"/>
-    </w:lvlOverride>
-    <w:lvlOverride w:ilvl="2">
-      <w:startOverride w:val="1"/>
-    </w:lvlOverride>
-    <w:lvlOverride w:ilvl="3">
-      <w:startOverride w:val="1"/>
-    </w:lvlOverride>
-    <w:lvlOverride w:ilvl="4">
-      <w:startOverride w:val="1"/>
-    </w:lvlOverride>
-    <w:lvlOverride w:ilvl="5">
-      <w:startOverride w:val="1"/>
-    </w:lvlOverride>
-    <w:lvlOverride w:ilvl="6">
-      <w:startOverride w:val="1"/>
-    </w:lvlOverride>
-    <w:lvlOverride w:ilvl="7">
-      <w:startOverride w:val="1"/>
-    </w:lvlOverride>
-    <w:lvlOverride w:ilvl="8">
-      <w:startOverride w:val="1"/>
-    </w:lvlOverride>
+    <w:abstractNumId w:val="991"/>
   </w:num>
   <w:num w:numId="1006">
     <w:abstractNumId w:val="99411"/>
@@ -13057,9 +13572,6 @@
     </w:lvlOverride>
   </w:num>
   <w:num w:numId="1007">
-    <w:abstractNumId w:val="991"/>
-  </w:num>
-  <w:num w:numId="1008">
     <w:abstractNumId w:val="99411"/>
     <w:lvlOverride w:ilvl="0">
       <w:startOverride w:val="1"/>
@@ -13088,6 +13600,9 @@
     <w:lvlOverride w:ilvl="8">
       <w:startOverride w:val="1"/>
     </w:lvlOverride>
+  </w:num>
+  <w:num w:numId="1008">
+    <w:abstractNumId w:val="991"/>
   </w:num>
   <w:num w:numId="1009">
     <w:abstractNumId w:val="99411"/>
@@ -13120,12 +13635,6 @@
     </w:lvlOverride>
   </w:num>
   <w:num w:numId="1010">
-    <w:abstractNumId w:val="991"/>
-  </w:num>
-  <w:num w:numId="1011">
-    <w:abstractNumId w:val="991"/>
-  </w:num>
-  <w:num w:numId="1012">
     <w:abstractNumId w:val="99411"/>
     <w:lvlOverride w:ilvl="0">
       <w:startOverride w:val="1"/>
@@ -13154,6 +13663,12 @@
     <w:lvlOverride w:ilvl="8">
       <w:startOverride w:val="1"/>
     </w:lvlOverride>
+  </w:num>
+  <w:num w:numId="1011">
+    <w:abstractNumId w:val="991"/>
+  </w:num>
+  <w:num w:numId="1012">
+    <w:abstractNumId w:val="991"/>
   </w:num>
   <w:num w:numId="1013">
     <w:abstractNumId w:val="99411"/>
@@ -13246,9 +13761,6 @@
     </w:lvlOverride>
   </w:num>
   <w:num w:numId="1016">
-    <w:abstractNumId w:val="991"/>
-  </w:num>
-  <w:num w:numId="1017">
     <w:abstractNumId w:val="99411"/>
     <w:lvlOverride w:ilvl="0">
       <w:startOverride w:val="1"/>
@@ -13277,6 +13789,9 @@
     <w:lvlOverride w:ilvl="8">
       <w:startOverride w:val="1"/>
     </w:lvlOverride>
+  </w:num>
+  <w:num w:numId="1017">
+    <w:abstractNumId w:val="991"/>
   </w:num>
   <w:num w:numId="1018">
     <w:abstractNumId w:val="99411"/>
@@ -13339,7 +13854,34 @@
     </w:lvlOverride>
   </w:num>
   <w:num w:numId="1020">
-    <w:abstractNumId w:val="992"/>
+    <w:abstractNumId w:val="99411"/>
+    <w:lvlOverride w:ilvl="0">
+      <w:startOverride w:val="1"/>
+    </w:lvlOverride>
+    <w:lvlOverride w:ilvl="1">
+      <w:startOverride w:val="1"/>
+    </w:lvlOverride>
+    <w:lvlOverride w:ilvl="2">
+      <w:startOverride w:val="1"/>
+    </w:lvlOverride>
+    <w:lvlOverride w:ilvl="3">
+      <w:startOverride w:val="1"/>
+    </w:lvlOverride>
+    <w:lvlOverride w:ilvl="4">
+      <w:startOverride w:val="1"/>
+    </w:lvlOverride>
+    <w:lvlOverride w:ilvl="5">
+      <w:startOverride w:val="1"/>
+    </w:lvlOverride>
+    <w:lvlOverride w:ilvl="6">
+      <w:startOverride w:val="1"/>
+    </w:lvlOverride>
+    <w:lvlOverride w:ilvl="7">
+      <w:startOverride w:val="1"/>
+    </w:lvlOverride>
+    <w:lvlOverride w:ilvl="8">
+      <w:startOverride w:val="1"/>
+    </w:lvlOverride>
   </w:num>
   <w:num w:numId="1021">
     <w:abstractNumId w:val="992"/>
@@ -13372,6 +13914,9 @@
     <w:abstractNumId w:val="992"/>
   </w:num>
   <w:num w:numId="1031">
+    <w:abstractNumId w:val="992"/>
+  </w:num>
+  <w:num w:numId="1032">
     <w:abstractNumId w:val="992"/>
   </w:num>
 </w:numbering>

</xml_diff>